<commit_message>
fix: change model to gemini-1.5-flash to resolve 404 not found for v1beta and update reports
</commit_message>
<xml_diff>
--- a/Documentacion/Informes/2026-07-13-cer-suite-cl-local-core-cloud/Informe_Analisis_DIFFs_2026-07-13.docx
+++ b/Documentacion/Informes/2026-07-13-cer-suite-cl-local-core-cloud/Informe_Analisis_DIFFs_2026-07-13.docx
@@ -7,1705 +7,9 @@
         <w:spacing w:after="120"/>
       </w:pPr>
       <w:r>
-        <w:t>La rama revisada fue: cer-suite-cl-local-core-cloud</w:t>
+        <w:t>Could not generate consolidated analysis due to an error: 404 models/gemini-1.5-pro is not found for API version v1beta, or is not supported for generateContent. Call ModelService.ListModels to see the list of available models and their supported methods.</w:t>
       </w:r>
     </w:p>
-    <w:p>
-      <w:pPr>
-        <w:spacing w:after="120"/>
-      </w:pPr>
-      <w:r>
-        <w:t>A continuación se presenta la evaluación técnica de los archivos de diferencias (diffs).</w:t>
-      </w:r>
-    </w:p>
-    <w:p>
-      <w:pPr>
-        <w:spacing w:after="120"/>
-      </w:pPr>
-      <w:r>
-        <w:t>1. Auditoría de Cambios en Procesamiento de XML Grandes e Invoice Data</w:t>
-      </w:r>
-    </w:p>
-    <w:p>
-      <w:pPr>
-        <w:spacing w:after="120"/>
-      </w:pPr>
-      <w:r/>
-      <w:r>
-        <w:rPr>
-          <w:b/>
-        </w:rPr>
-        <w:t>Técnico Responsable:</w:t>
-      </w:r>
-      <w:r>
-        <w:t xml:space="preserve"> rmunoz</w:t>
-      </w:r>
-    </w:p>
-    <w:p>
-      <w:pPr>
-        <w:spacing w:after="120"/>
-      </w:pPr>
-      <w:r/>
-      <w:r>
-        <w:rPr>
-          <w:b/>
-        </w:rPr>
-        <w:t>Fecha del Cambio:</w:t>
-      </w:r>
-      <w:r>
-        <w:t xml:space="preserve"> 04/06/2026 - 05/06/2026</w:t>
-      </w:r>
-    </w:p>
-    <w:p>
-      <w:pPr>
-        <w:spacing w:after="120"/>
-      </w:pPr>
-      <w:r>
-        <w:t>Archivos Analizados:</w:t>
-      </w:r>
-    </w:p>
-    <w:p>
-      <w:pPr>
-        <w:pStyle w:val="ListBullet"/>
-        <w:spacing w:after="40"/>
-      </w:pPr>
-      <w:r>
-        <w:t>src/main/java/com/elrosado/cersuitecloudlocalcore/service/XmlGeneratorService.java</w:t>
-      </w:r>
-    </w:p>
-    <w:p>
-      <w:pPr>
-        <w:pStyle w:val="ListBullet"/>
-        <w:spacing w:after="40"/>
-      </w:pPr>
-      <w:r>
-        <w:t>src/main/java/com/elrosado/cersuitecloudlocalcore/domain/model/InvoiceData.java</w:t>
-      </w:r>
-    </w:p>
-    <w:p>
-      <w:pPr>
-        <w:pStyle w:val="ListBullet"/>
-        <w:spacing w:after="40"/>
-      </w:pPr>
-      <w:r>
-        <w:t>src/main/java/com/elrosado/cersuitecloudlocalcore/domain/model/TaxType.java</w:t>
-      </w:r>
-    </w:p>
-    <w:p>
-      <w:pPr>
-        <w:spacing w:after="120"/>
-      </w:pPr>
-      <w:r>
-        <w:t>Evidencia Técnica:</w:t>
-      </w:r>
-    </w:p>
-    <w:p>
-      <w:pPr>
-        <w:pStyle w:val="ListBullet"/>
-        <w:spacing w:after="40"/>
-      </w:pPr>
-      <w:r>
-        <w:t>Ajuste del flujo de lectura de XML pesados utilizando streaming para evitar la sobrecarga de memoria heap.</w:t>
-      </w:r>
-    </w:p>
-    <w:p>
-      <w:pPr>
-        <w:pStyle w:val="ListBullet"/>
-        <w:spacing w:after="40"/>
-      </w:pPr>
-      <w:r>
-        <w:t>Integración de propiedades de formato específicas de taxtype y datos de facturación para la estructuración de comprobantes electrónicos generados.</w:t>
-      </w:r>
-    </w:p>
-    <w:p>
-      <w:pPr>
-        <w:spacing w:after="120"/>
-      </w:pPr>
-      <w:r>
-        <w:t>Resultado del Modelo:</w:t>
-      </w:r>
-    </w:p>
-    <w:p>
-      <w:pPr>
-        <w:pStyle w:val="ListBullet"/>
-        <w:spacing w:after="40"/>
-      </w:pPr>
-      <w:r>
-        <w:t>Veredicto: Coherente / Funcional</w:t>
-      </w:r>
-    </w:p>
-    <w:p>
-      <w:pPr>
-        <w:pStyle w:val="ListBullet"/>
-        <w:spacing w:after="40"/>
-      </w:pPr>
-      <w:r>
-        <w:t>Complejidad Técnica Real: Media</w:t>
-      </w:r>
-    </w:p>
-    <w:p>
-      <w:pPr>
-        <w:pStyle w:val="ListBullet"/>
-        <w:spacing w:after="40"/>
-      </w:pPr>
-      <w:r>
-        <w:t>Explicación al PM: Se corrigieron errores en el procesamiento de facturas con tamaños de archivo elevados y se ajustaron los datos de impuestos para la facturación local.</w:t>
-      </w:r>
-    </w:p>
-    <w:p>
-      <w:pPr>
-        <w:pStyle w:val="ListBullet"/>
-        <w:spacing w:after="40"/>
-      </w:pPr>
-      <w:r>
-        <w:t>Alerta de Auditoría: Ninguna</w:t>
-      </w:r>
-    </w:p>
-    <w:p>
-      <w:pPr>
-        <w:spacing w:after="120"/>
-      </w:pPr>
-      <w:r>
-        <w:t>2. Auditoría de Cambios en Kubernetes y Dockerfiles</w:t>
-      </w:r>
-    </w:p>
-    <w:p>
-      <w:pPr>
-        <w:spacing w:after="120"/>
-      </w:pPr>
-      <w:r/>
-      <w:r>
-        <w:rPr>
-          <w:b/>
-        </w:rPr>
-        <w:t>Técnico Responsable:</w:t>
-      </w:r>
-      <w:r>
-        <w:t xml:space="preserve"> rmunoz</w:t>
-      </w:r>
-    </w:p>
-    <w:p>
-      <w:pPr>
-        <w:spacing w:after="120"/>
-      </w:pPr>
-      <w:r/>
-      <w:r>
-        <w:rPr>
-          <w:b/>
-        </w:rPr>
-        <w:t>Fecha del Cambio:</w:t>
-      </w:r>
-      <w:r>
-        <w:t xml:space="preserve"> 05/06/2026 - 16/06/2026</w:t>
-      </w:r>
-    </w:p>
-    <w:p>
-      <w:pPr>
-        <w:spacing w:after="120"/>
-      </w:pPr>
-      <w:r>
-        <w:t>Archivos Analizados:</w:t>
-      </w:r>
-    </w:p>
-    <w:p>
-      <w:pPr>
-        <w:pStyle w:val="ListBullet"/>
-        <w:spacing w:after="40"/>
-      </w:pPr>
-      <w:r>
-        <w:t>Dockerfile</w:t>
-      </w:r>
-    </w:p>
-    <w:p>
-      <w:pPr>
-        <w:pStyle w:val="ListBullet"/>
-        <w:spacing w:after="40"/>
-      </w:pPr>
-      <w:r>
-        <w:t>docker/dev/Dockerfile.dev</w:t>
-      </w:r>
-    </w:p>
-    <w:p>
-      <w:pPr>
-        <w:pStyle w:val="ListBullet"/>
-        <w:spacing w:after="40"/>
-      </w:pPr>
-      <w:r>
-        <w:t>k8s/deployment.yaml</w:t>
-      </w:r>
-    </w:p>
-    <w:p>
-      <w:pPr>
-        <w:pStyle w:val="ListBullet"/>
-        <w:spacing w:after="40"/>
-      </w:pPr>
-      <w:r>
-        <w:t>k8s/configmap.yaml</w:t>
-      </w:r>
-    </w:p>
-    <w:p>
-      <w:pPr>
-        <w:pStyle w:val="ListBullet"/>
-        <w:spacing w:after="40"/>
-      </w:pPr>
-      <w:r>
-        <w:t>k8s/secret.yaml</w:t>
-      </w:r>
-    </w:p>
-    <w:p>
-      <w:pPr>
-        <w:spacing w:after="120"/>
-      </w:pPr>
-      <w:r>
-        <w:t>Evidencia Técnica:</w:t>
-      </w:r>
-    </w:p>
-    <w:p>
-      <w:pPr>
-        <w:pStyle w:val="ListBullet"/>
-        <w:spacing w:after="40"/>
-      </w:pPr>
-      <w:r>
-        <w:t>Modificación del Dockerfile principal para habilitar la compilación multi-etapa (multi-stage) optimizando el tamaño final de la imagen Java.</w:t>
-      </w:r>
-    </w:p>
-    <w:p>
-      <w:pPr>
-        <w:pStyle w:val="ListBullet"/>
-        <w:spacing w:after="40"/>
-      </w:pPr>
-      <w:r>
-        <w:t>Ajuste en los manifiestos de Kubernetes: adición de volumenes dedicados en deployment.yaml, eliminación de dependencias JWT locales redundantes y parametrización de variables en secret.yaml y configmap.yaml.</w:t>
-      </w:r>
-    </w:p>
-    <w:p>
-      <w:pPr>
-        <w:spacing w:after="120"/>
-      </w:pPr>
-      <w:r>
-        <w:t>Resultado del Modelo:</w:t>
-      </w:r>
-    </w:p>
-    <w:p>
-      <w:pPr>
-        <w:pStyle w:val="ListBullet"/>
-        <w:spacing w:after="40"/>
-      </w:pPr>
-      <w:r>
-        <w:t>Veredicto: Coherente / Funcional</w:t>
-      </w:r>
-    </w:p>
-    <w:p>
-      <w:pPr>
-        <w:pStyle w:val="ListBullet"/>
-        <w:spacing w:after="40"/>
-      </w:pPr>
-      <w:r>
-        <w:t>Complejidad Técnica Real: Media</w:t>
-      </w:r>
-    </w:p>
-    <w:p>
-      <w:pPr>
-        <w:pStyle w:val="ListBullet"/>
-        <w:spacing w:after="40"/>
-      </w:pPr>
-      <w:r>
-        <w:t>Explicación al PM: Se optimizó el proceso de compilación del contenedor Docker y se actualizó la infraestructura en Kubernetes para el despliegue dinámico en ambientes de prueba y producción.</w:t>
-      </w:r>
-    </w:p>
-    <w:p>
-      <w:pPr>
-        <w:pStyle w:val="ListBullet"/>
-        <w:spacing w:after="40"/>
-      </w:pPr>
-      <w:r>
-        <w:t>Alerta de Auditoría: Ninguna</w:t>
-      </w:r>
-    </w:p>
-    <w:p>
-      <w:pPr>
-        <w:spacing w:after="120"/>
-      </w:pPr>
-      <w:r>
-        <w:t>3. Auditoría de Cambios en Desacoplamiento de GCP y Biblioteca PubSub</w:t>
-      </w:r>
-    </w:p>
-    <w:p>
-      <w:pPr>
-        <w:spacing w:after="120"/>
-      </w:pPr>
-      <w:r/>
-      <w:r>
-        <w:rPr>
-          <w:b/>
-        </w:rPr>
-        <w:t>Técnico Responsable:</w:t>
-      </w:r>
-      <w:r>
-        <w:t xml:space="preserve"> rmunoz</w:t>
-      </w:r>
-    </w:p>
-    <w:p>
-      <w:pPr>
-        <w:spacing w:after="120"/>
-      </w:pPr>
-      <w:r/>
-      <w:r>
-        <w:rPr>
-          <w:b/>
-        </w:rPr>
-        <w:t>Fecha del Cambio:</w:t>
-      </w:r>
-      <w:r>
-        <w:t xml:space="preserve"> 06/06/2026 - 16/06/2026</w:t>
-      </w:r>
-    </w:p>
-    <w:p>
-      <w:pPr>
-        <w:spacing w:after="120"/>
-      </w:pPr>
-      <w:r>
-        <w:t>Archivos Analizados:</w:t>
-      </w:r>
-    </w:p>
-    <w:p>
-      <w:pPr>
-        <w:pStyle w:val="ListBullet"/>
-        <w:spacing w:after="40"/>
-      </w:pPr>
-      <w:r>
-        <w:t>pom.xml</w:t>
-      </w:r>
-    </w:p>
-    <w:p>
-      <w:pPr>
-        <w:pStyle w:val="ListBullet"/>
-        <w:spacing w:after="40"/>
-      </w:pPr>
-      <w:r>
-        <w:t>src/main/java/com/elrosado/cersuitecloudlocalcore/infrastructure/adapter/out/messaging/PubSubClient.java</w:t>
-      </w:r>
-    </w:p>
-    <w:p>
-      <w:pPr>
-        <w:pStyle w:val="ListBullet"/>
-        <w:spacing w:after="40"/>
-      </w:pPr>
-      <w:r>
-        <w:t>Libs/jlib-pubsub-1.0.0.jar (referencia de dependencia local)</w:t>
-      </w:r>
-    </w:p>
-    <w:p>
-      <w:pPr>
-        <w:spacing w:after="120"/>
-      </w:pPr>
-      <w:r>
-        <w:t>Evidencia Técnica:</w:t>
-      </w:r>
-    </w:p>
-    <w:p>
-      <w:pPr>
-        <w:pStyle w:val="ListBullet"/>
-        <w:spacing w:after="40"/>
-      </w:pPr>
-      <w:r>
-        <w:t>Remoción de las dependencias globales directas del SDK de Google Cloud Platform de mensajería del pom.xml.</w:t>
-      </w:r>
-    </w:p>
-    <w:p>
-      <w:pPr>
-        <w:pStyle w:val="ListBullet"/>
-        <w:spacing w:after="40"/>
-      </w:pPr>
-      <w:r>
-        <w:t>Migración al uso de la biblioteca de mensajería empaquetada internamente (`jlib-pubsub`) para simplificar y unificar las colas de mensajería pub/sub locales.</w:t>
-      </w:r>
-    </w:p>
-    <w:p>
-      <w:pPr>
-        <w:spacing w:after="120"/>
-      </w:pPr>
-      <w:r>
-        <w:t>Resultado del Modelo:</w:t>
-      </w:r>
-    </w:p>
-    <w:p>
-      <w:pPr>
-        <w:pStyle w:val="ListBullet"/>
-        <w:spacing w:after="40"/>
-      </w:pPr>
-      <w:r>
-        <w:t>Veredicto: Coherente / Funcional</w:t>
-      </w:r>
-    </w:p>
-    <w:p>
-      <w:pPr>
-        <w:pStyle w:val="ListBullet"/>
-        <w:spacing w:after="40"/>
-      </w:pPr>
-      <w:r>
-        <w:t>Complejidad Técnica Real: Alta</w:t>
-      </w:r>
-    </w:p>
-    <w:p>
-      <w:pPr>
-        <w:pStyle w:val="ListBullet"/>
-        <w:spacing w:after="40"/>
-      </w:pPr>
-      <w:r>
-        <w:t>Explicación al PM: Se sustituyó el proveedor directo de la nube de Google Cloud PubSub por una librería propia más liviana y reutilizable que optimiza las colas de procesamiento.</w:t>
-      </w:r>
-    </w:p>
-    <w:p>
-      <w:pPr>
-        <w:pStyle w:val="ListBullet"/>
-        <w:spacing w:after="40"/>
-      </w:pPr>
-      <w:r>
-        <w:t>Alerta de Auditoría: Ninguna</w:t>
-      </w:r>
-    </w:p>
-    <w:p>
-      <w:pPr>
-        <w:spacing w:after="120"/>
-      </w:pPr>
-      <w:r>
-        <w:t>4. Auditoría de Cambios en Gestión de Archivos de Logs y Configuraciones</w:t>
-      </w:r>
-    </w:p>
-    <w:p>
-      <w:pPr>
-        <w:spacing w:after="120"/>
-      </w:pPr>
-      <w:r/>
-      <w:r>
-        <w:rPr>
-          <w:b/>
-        </w:rPr>
-        <w:t>Técnico Responsable:</w:t>
-      </w:r>
-      <w:r>
-        <w:t xml:space="preserve"> rmunoz</w:t>
-      </w:r>
-    </w:p>
-    <w:p>
-      <w:pPr>
-        <w:spacing w:after="120"/>
-      </w:pPr>
-      <w:r/>
-      <w:r>
-        <w:rPr>
-          <w:b/>
-        </w:rPr>
-        <w:t>Fecha del Cambio:</w:t>
-      </w:r>
-      <w:r>
-        <w:t xml:space="preserve"> 11/06/2026 - 18/06/2026</w:t>
-      </w:r>
-    </w:p>
-    <w:p>
-      <w:pPr>
-        <w:spacing w:after="120"/>
-      </w:pPr>
-      <w:r>
-        <w:t>Archivos Analizados:</w:t>
-      </w:r>
-    </w:p>
-    <w:p>
-      <w:pPr>
-        <w:pStyle w:val="ListBullet"/>
-        <w:spacing w:after="40"/>
-      </w:pPr>
-      <w:r>
-        <w:t>src/main/resources/logback-spring.xml</w:t>
-      </w:r>
-    </w:p>
-    <w:p>
-      <w:pPr>
-        <w:pStyle w:val="ListBullet"/>
-        <w:spacing w:after="40"/>
-      </w:pPr>
-      <w:r>
-        <w:t>src/main/resources/application-dev.yml</w:t>
-      </w:r>
-    </w:p>
-    <w:p>
-      <w:pPr>
-        <w:pStyle w:val="ListBullet"/>
-        <w:spacing w:after="40"/>
-      </w:pPr>
-      <w:r>
-        <w:t>.gitignore</w:t>
-      </w:r>
-    </w:p>
-    <w:p>
-      <w:pPr>
-        <w:pStyle w:val="ListBullet"/>
-        <w:spacing w:after="40"/>
-      </w:pPr>
-      <w:r>
-        <w:t>logs/app.log (eliminado)</w:t>
-      </w:r>
-    </w:p>
-    <w:p>
-      <w:pPr>
-        <w:spacing w:after="120"/>
-      </w:pPr>
-      <w:r>
-        <w:t>Evidencia Técnica:</w:t>
-      </w:r>
-    </w:p>
-    <w:p>
-      <w:pPr>
-        <w:pStyle w:val="ListBullet"/>
-        <w:spacing w:after="40"/>
-      </w:pPr>
-      <w:r>
-        <w:t>Eliminación física de archivos de logs en caliente `app.log` del control de versiones.</w:t>
-      </w:r>
-    </w:p>
-    <w:p>
-      <w:pPr>
-        <w:pStyle w:val="ListBullet"/>
-        <w:spacing w:after="40"/>
-      </w:pPr>
-      <w:r>
-        <w:t>Configuración de logback-spring.xml para rotar y estructurar las trazas de logs del contenedor en consola de manera asíncrona.</w:t>
-      </w:r>
-    </w:p>
-    <w:p>
-      <w:pPr>
-        <w:pStyle w:val="ListBullet"/>
-        <w:spacing w:after="40"/>
-      </w:pPr>
-      <w:r>
-        <w:t>Inyección de propiedades de conexión y depuración en el archivo yml de desarrollo.</w:t>
-      </w:r>
-    </w:p>
-    <w:p>
-      <w:pPr>
-        <w:spacing w:after="120"/>
-      </w:pPr>
-      <w:r>
-        <w:t>Resultado del Modelo:</w:t>
-      </w:r>
-    </w:p>
-    <w:p>
-      <w:pPr>
-        <w:pStyle w:val="ListBullet"/>
-        <w:spacing w:after="40"/>
-      </w:pPr>
-      <w:r>
-        <w:t>Veredicto: Coherente / Funcional</w:t>
-      </w:r>
-    </w:p>
-    <w:p>
-      <w:pPr>
-        <w:pStyle w:val="ListBullet"/>
-        <w:spacing w:after="40"/>
-      </w:pPr>
-      <w:r>
-        <w:t>Complejidad Técnica Real: Baja</w:t>
-      </w:r>
-    </w:p>
-    <w:p>
-      <w:pPr>
-        <w:pStyle w:val="ListBullet"/>
-        <w:spacing w:after="40"/>
-      </w:pPr>
-      <w:r>
-        <w:t>Explicación al PM: Se removieron archivos temporales y locales del repositorio git y se configuró correctamente la salida estándar de registros del microservicio.</w:t>
-      </w:r>
-    </w:p>
-    <w:p>
-      <w:pPr>
-        <w:pStyle w:val="ListBullet"/>
-        <w:spacing w:after="40"/>
-      </w:pPr>
-      <w:r>
-        <w:t>Alerta de Auditoría: Ninguna</w:t>
-      </w:r>
-    </w:p>
-    <w:p>
-      <w:pPr>
-        <w:spacing w:after="120"/>
-      </w:pPr>
-      <w:r>
-        <w:t>5. Auditoría de Cambios en Soporte Multi-Base de Datos SQL (MultiSql)</w:t>
-      </w:r>
-    </w:p>
-    <w:p>
-      <w:pPr>
-        <w:spacing w:after="120"/>
-      </w:pPr>
-      <w:r/>
-      <w:r>
-        <w:rPr>
-          <w:b/>
-        </w:rPr>
-        <w:t>Técnico Responsable:</w:t>
-      </w:r>
-      <w:r>
-        <w:t xml:space="preserve"> rmunoz</w:t>
-      </w:r>
-    </w:p>
-    <w:p>
-      <w:pPr>
-        <w:spacing w:after="120"/>
-      </w:pPr>
-      <w:r/>
-      <w:r>
-        <w:rPr>
-          <w:b/>
-        </w:rPr>
-        <w:t>Fecha del Cambio:</w:t>
-      </w:r>
-      <w:r>
-        <w:t xml:space="preserve"> 17/06/2026 - 18/06/2026</w:t>
-      </w:r>
-    </w:p>
-    <w:p>
-      <w:pPr>
-        <w:spacing w:after="120"/>
-      </w:pPr>
-      <w:r>
-        <w:t>Archivos Analizados:</w:t>
-      </w:r>
-    </w:p>
-    <w:p>
-      <w:pPr>
-        <w:pStyle w:val="ListBullet"/>
-        <w:spacing w:after="40"/>
-      </w:pPr>
-      <w:r>
-        <w:t>src/main/java/com/elrosado/cersuitecloudlocalcore/infrastructure/config/MultiSqlConfig.java</w:t>
-      </w:r>
-    </w:p>
-    <w:p>
-      <w:pPr>
-        <w:pStyle w:val="ListBullet"/>
-        <w:spacing w:after="40"/>
-      </w:pPr>
-      <w:r>
-        <w:t>src/main/java/com/elrosado/cersuitecloudlocalcore/infrastructure/config/ArtsEcDataSourceConfig.java</w:t>
-      </w:r>
-    </w:p>
-    <w:p>
-      <w:pPr>
-        <w:pStyle w:val="ListBullet"/>
-        <w:spacing w:after="40"/>
-      </w:pPr>
-      <w:r>
-        <w:t>src/main/java/com/elrosado/cersuitecloudlocalcore/infrastructure/config/DevsDataSourceConfig.java</w:t>
-      </w:r>
-    </w:p>
-    <w:p>
-      <w:pPr>
-        <w:spacing w:after="120"/>
-      </w:pPr>
-      <w:r>
-        <w:t>Evidencia Técnica:</w:t>
-      </w:r>
-    </w:p>
-    <w:p>
-      <w:pPr>
-        <w:pStyle w:val="ListBullet"/>
-        <w:spacing w:after="40"/>
-      </w:pPr>
-      <w:r>
-        <w:t>Implementación de configuración de persistencia dual en Spring Boot usando múltiples instancias de DataSource.</w:t>
-      </w:r>
-    </w:p>
-    <w:p>
-      <w:pPr>
-        <w:pStyle w:val="ListBullet"/>
-        <w:spacing w:after="40"/>
-      </w:pPr>
-      <w:r>
-        <w:t>Configuración separada de EntityManagerFactory y TransactionManager correspondientes a los esquemas `arts_ec` (producción/transaccional local) y `devs` (desarrollo/monitoreo).</w:t>
-      </w:r>
-    </w:p>
-    <w:p>
-      <w:pPr>
-        <w:spacing w:after="120"/>
-      </w:pPr>
-      <w:r>
-        <w:t>Resultado del Modelo:</w:t>
-      </w:r>
-    </w:p>
-    <w:p>
-      <w:pPr>
-        <w:pStyle w:val="ListBullet"/>
-        <w:spacing w:after="40"/>
-      </w:pPr>
-      <w:r>
-        <w:t>Veredicto: Coherente / Funcional</w:t>
-      </w:r>
-    </w:p>
-    <w:p>
-      <w:pPr>
-        <w:pStyle w:val="ListBullet"/>
-        <w:spacing w:after="40"/>
-      </w:pPr>
-      <w:r>
-        <w:t>Complejidad Técnica Real: Alta</w:t>
-      </w:r>
-    </w:p>
-    <w:p>
-      <w:pPr>
-        <w:pStyle w:val="ListBullet"/>
-        <w:spacing w:after="40"/>
-      </w:pPr>
-      <w:r>
-        <w:t>Explicación al PM: Se configuró el sistema para que pueda consultar y persistir información de manera simultánea en dos bases de datos SQL distintas y separadas.</w:t>
-      </w:r>
-    </w:p>
-    <w:p>
-      <w:pPr>
-        <w:pStyle w:val="ListBullet"/>
-        <w:spacing w:after="40"/>
-      </w:pPr>
-      <w:r>
-        <w:t>Alerta de Auditoría: Ninguna</w:t>
-      </w:r>
-    </w:p>
-    <w:p>
-      <w:pPr>
-        <w:spacing w:after="120"/>
-      </w:pPr>
-      <w:r>
-        <w:t>6. Auditoría de Cambios en Procesos de Negocio, Cierre FTP y Reversos</w:t>
-      </w:r>
-    </w:p>
-    <w:p>
-      <w:pPr>
-        <w:spacing w:after="120"/>
-      </w:pPr>
-      <w:r/>
-      <w:r>
-        <w:rPr>
-          <w:b/>
-        </w:rPr>
-        <w:t>Técnico Responsable:</w:t>
-      </w:r>
-      <w:r>
-        <w:t xml:space="preserve"> rmunoz</w:t>
-      </w:r>
-    </w:p>
-    <w:p>
-      <w:pPr>
-        <w:spacing w:after="120"/>
-      </w:pPr>
-      <w:r/>
-      <w:r>
-        <w:rPr>
-          <w:b/>
-        </w:rPr>
-        <w:t>Fecha del Cambio:</w:t>
-      </w:r>
-      <w:r>
-        <w:t xml:space="preserve"> 13/06/2026 - 01/07/2026</w:t>
-      </w:r>
-    </w:p>
-    <w:p>
-      <w:pPr>
-        <w:spacing w:after="120"/>
-      </w:pPr>
-      <w:r>
-        <w:t>Archivos Analizados:</w:t>
-      </w:r>
-    </w:p>
-    <w:p>
-      <w:pPr>
-        <w:pStyle w:val="ListBullet"/>
-        <w:spacing w:after="40"/>
-      </w:pPr>
-      <w:r>
-        <w:t>src/main/java/com/elrosado/cersuitecloudlocalcore/domain/port/out/UpdateCedPadRucPort.java</w:t>
-      </w:r>
-    </w:p>
-    <w:p>
-      <w:pPr>
-        <w:pStyle w:val="ListBullet"/>
-        <w:spacing w:after="40"/>
-      </w:pPr>
-      <w:r>
-        <w:t>src/main/java/com/elrosado/cersuitecloudlocalcore/domain/model/PaymentReversal.java</w:t>
-      </w:r>
-    </w:p>
-    <w:p>
-      <w:pPr>
-        <w:pStyle w:val="ListBullet"/>
-        <w:spacing w:after="40"/>
-      </w:pPr>
-      <w:r>
-        <w:t>src/main/java/com/elrosado/cersuitecloudlocalcore/infrastructure/adapter/in/scheduler/ReprocessErrorSchedulerAdapter.java</w:t>
-      </w:r>
-    </w:p>
-    <w:p>
-      <w:pPr>
-        <w:pStyle w:val="ListBullet"/>
-        <w:spacing w:after="40"/>
-      </w:pPr>
-      <w:r>
-        <w:t>src/main/java/com/elrosado/cersuitecloudlocalcore/infrastructure/adapter/out/ftp/FileSenderFTPCierreDiaAdapter.java</w:t>
-      </w:r>
-    </w:p>
-    <w:p>
-      <w:pPr>
-        <w:spacing w:after="120"/>
-      </w:pPr>
-      <w:r>
-        <w:t>Evidencia Técnica:</w:t>
-      </w:r>
-    </w:p>
-    <w:p>
-      <w:pPr>
-        <w:pStyle w:val="ListBullet"/>
-        <w:spacing w:after="40"/>
-      </w:pPr>
-      <w:r>
-        <w:t>Migración y refactorización de flujos de negocio legados. Carga programada del maestro de RUC/Cédulas, lógica de reversión de transacciones de tarjetas (pagos, consumos) basadas en tramas ISO-8583.</w:t>
-      </w:r>
-    </w:p>
-    <w:p>
-      <w:pPr>
-        <w:pStyle w:val="ListBullet"/>
-        <w:spacing w:after="40"/>
-      </w:pPr>
-      <w:r>
-        <w:t>Adaptador de scheduler de reintento de errores genéricos e implementación de canal de transferencia FTP seguro para el cierre diario de ventas y lotes.</w:t>
-      </w:r>
-    </w:p>
-    <w:p>
-      <w:pPr>
-        <w:spacing w:after="120"/>
-      </w:pPr>
-      <w:r>
-        <w:t>Resultado del Modelo:</w:t>
-      </w:r>
-    </w:p>
-    <w:p>
-      <w:pPr>
-        <w:pStyle w:val="ListBullet"/>
-        <w:spacing w:after="40"/>
-      </w:pPr>
-      <w:r>
-        <w:t>Veredicto: Coherente / Funcional</w:t>
-      </w:r>
-    </w:p>
-    <w:p>
-      <w:pPr>
-        <w:pStyle w:val="ListBullet"/>
-        <w:spacing w:after="40"/>
-      </w:pPr>
-      <w:r>
-        <w:t>Complejidad Técnica Real: Alta</w:t>
-      </w:r>
-    </w:p>
-    <w:p>
-      <w:pPr>
-        <w:pStyle w:val="ListBullet"/>
-        <w:spacing w:after="40"/>
-      </w:pPr>
-      <w:r>
-        <w:t>Explicación al PM: Se completó la migración técnica de las reglas de negocio principales hacia el nuevo esquema del worker (incluyendo reversos financieros, automatizaciones y reportes FTP).</w:t>
-      </w:r>
-    </w:p>
-    <w:p>
-      <w:pPr>
-        <w:pStyle w:val="ListBullet"/>
-        <w:spacing w:after="40"/>
-      </w:pPr>
-      <w:r>
-        <w:t>Alerta de Auditoría: Ninguna</w:t>
-      </w:r>
-    </w:p>
-    <w:p>
-      <w:pPr>
-        <w:spacing w:after="120"/>
-      </w:pPr>
-      <w:r>
-        <w:t>7. Auditoría de Cambios en Ajustes Finales, Excepciones y Reglas Generales</w:t>
-      </w:r>
-    </w:p>
-    <w:p>
-      <w:pPr>
-        <w:spacing w:after="120"/>
-      </w:pPr>
-      <w:r/>
-      <w:r>
-        <w:rPr>
-          <w:b/>
-        </w:rPr>
-        <w:t>Técnico Responsable:</w:t>
-      </w:r>
-      <w:r>
-        <w:t xml:space="preserve"> rmunoz</w:t>
-      </w:r>
-    </w:p>
-    <w:p>
-      <w:pPr>
-        <w:spacing w:after="120"/>
-      </w:pPr>
-      <w:r/>
-      <w:r>
-        <w:rPr>
-          <w:b/>
-        </w:rPr>
-        <w:t>Fecha del Cambio:</w:t>
-      </w:r>
-      <w:r>
-        <w:t xml:space="preserve"> 02/07/2026 - 03/07/2026</w:t>
-      </w:r>
-    </w:p>
-    <w:p>
-      <w:pPr>
-        <w:spacing w:after="120"/>
-      </w:pPr>
-      <w:r>
-        <w:t>Archivos Analizados:</w:t>
-      </w:r>
-    </w:p>
-    <w:p>
-      <w:pPr>
-        <w:pStyle w:val="ListBullet"/>
-        <w:spacing w:after="40"/>
-      </w:pPr>
-      <w:r>
-        <w:t>.claude_rules/security.md</w:t>
-      </w:r>
-    </w:p>
-    <w:p>
-      <w:pPr>
-        <w:pStyle w:val="ListBullet"/>
-        <w:spacing w:after="40"/>
-      </w:pPr>
-      <w:r>
-        <w:t>src/main/java/com/elrosado/cersuitecloudlocalcore/domain/exception/SearchInventarioStickerException.java</w:t>
-      </w:r>
-    </w:p>
-    <w:p>
-      <w:pPr>
-        <w:pStyle w:val="ListBullet"/>
-        <w:spacing w:after="40"/>
-      </w:pPr>
-      <w:r>
-        <w:t>src/main/java/com/elrosado/cersuitecloudlocalcore/domain/model/JournalEntry.java</w:t>
-      </w:r>
-    </w:p>
-    <w:p>
-      <w:pPr>
-        <w:spacing w:after="120"/>
-      </w:pPr>
-      <w:r>
-        <w:t>Evidencia Técnica:</w:t>
-      </w:r>
-    </w:p>
-    <w:p>
-      <w:pPr>
-        <w:pStyle w:val="ListBullet"/>
-        <w:spacing w:after="40"/>
-      </w:pPr>
-      <w:r>
-        <w:t>Configuración de reglas y buenas prácticas de seguridad locales en formato Markdown.</w:t>
-      </w:r>
-    </w:p>
-    <w:p>
-      <w:pPr>
-        <w:pStyle w:val="ListBullet"/>
-        <w:spacing w:after="40"/>
-      </w:pPr>
-      <w:r>
-        <w:t>Adición de excepciones estructuradas para el inventario de stickers y mapeo de diario de transacciones (journaling) en BD local.</w:t>
-      </w:r>
-    </w:p>
-    <w:p>
-      <w:pPr>
-        <w:spacing w:after="120"/>
-      </w:pPr>
-      <w:r>
-        <w:t>Resultado del Modelo:</w:t>
-      </w:r>
-    </w:p>
-    <w:p>
-      <w:pPr>
-        <w:pStyle w:val="ListBullet"/>
-        <w:spacing w:after="40"/>
-      </w:pPr>
-      <w:r>
-        <w:t>Veredicto: Coherente / Funcional</w:t>
-      </w:r>
-    </w:p>
-    <w:p>
-      <w:pPr>
-        <w:pStyle w:val="ListBullet"/>
-        <w:spacing w:after="40"/>
-      </w:pPr>
-      <w:r>
-        <w:t>Complejidad Técnica Real: Media</w:t>
-      </w:r>
-    </w:p>
-    <w:p>
-      <w:pPr>
-        <w:pStyle w:val="ListBullet"/>
-        <w:spacing w:after="40"/>
-      </w:pPr>
-      <w:r>
-        <w:t>Explicación al PM: Se añadieron protecciones de excepciones de negocio y la documentación reglamentaria de seguridad del sistema.</w:t>
-      </w:r>
-    </w:p>
-    <w:p>
-      <w:pPr>
-        <w:pStyle w:val="ListBullet"/>
-        <w:spacing w:after="40"/>
-      </w:pPr>
-      <w:r>
-        <w:t>Alerta de Auditoría: Ninguna</w:t>
-      </w:r>
-    </w:p>
-    <w:p>
-      <w:pPr>
-        <w:spacing w:after="120"/>
-      </w:pPr>
-      <w:r>
-        <w:t>Resumen Ejecutivo para Toma de Decisiones</w:t>
-      </w:r>
-    </w:p>
-    <w:p>
-      <w:pPr>
-        <w:spacing w:after="120"/>
-      </w:pPr>
-      <w:r>
-        <w:t>Este cuadro resume la información para que usted y el PM aprueben las horas reportadas.</w:t>
-      </w:r>
-    </w:p>
-    <w:tbl>
-      <w:tblPr>
-        <w:tblStyle w:val="LightShading-Accent1"/>
-        <w:tblW w:type="auto" w:w="0"/>
-        <w:tblLook w:firstColumn="1" w:firstRow="1" w:lastColumn="0" w:lastRow="0" w:noHBand="0" w:noVBand="1" w:val="04A0"/>
-      </w:tblPr>
-      <w:tblGrid>
-        <w:gridCol w:w="1872"/>
-        <w:gridCol w:w="1872"/>
-        <w:gridCol w:w="1872"/>
-        <w:gridCol w:w="1872"/>
-        <w:gridCol w:w="1872"/>
-      </w:tblGrid>
-      <w:tr>
-        <w:tc>
-          <w:tcPr>
-            <w:tcW w:type="dxa" w:w="1872"/>
-            <w:shd w:fill="1F497D"/>
-          </w:tcPr>
-          <w:p>
-            <w:r>
-              <w:rPr>
-                <w:b/>
-                <w:color w:val="FFFFFF"/>
-              </w:rPr>
-            </w:r>
-            <w:r>
-              <w:rPr>
-                <w:b/>
-                <w:color w:val="FFFFFF"/>
-              </w:rPr>
-              <w:t>Fecha</w:t>
-            </w:r>
-          </w:p>
-        </w:tc>
-        <w:tc>
-          <w:tcPr>
-            <w:tcW w:type="dxa" w:w="1872"/>
-            <w:shd w:fill="1F497D"/>
-          </w:tcPr>
-          <w:p>
-            <w:r>
-              <w:rPr>
-                <w:b/>
-                <w:color w:val="FFFFFF"/>
-              </w:rPr>
-            </w:r>
-            <w:r>
-              <w:rPr>
-                <w:b/>
-                <w:color w:val="FFFFFF"/>
-              </w:rPr>
-              <w:t>Técnico</w:t>
-            </w:r>
-          </w:p>
-        </w:tc>
-        <w:tc>
-          <w:tcPr>
-            <w:tcW w:type="dxa" w:w="1872"/>
-            <w:shd w:fill="1F497D"/>
-          </w:tcPr>
-          <w:p>
-            <w:r>
-              <w:rPr>
-                <w:b/>
-                <w:color w:val="FFFFFF"/>
-              </w:rPr>
-            </w:r>
-            <w:r>
-              <w:rPr>
-                <w:b/>
-                <w:color w:val="FFFFFF"/>
-              </w:rPr>
-              <w:t>Archivo / Módulo</w:t>
-            </w:r>
-          </w:p>
-        </w:tc>
-        <w:tc>
-          <w:tcPr>
-            <w:tcW w:type="dxa" w:w="1872"/>
-            <w:shd w:fill="1F497D"/>
-          </w:tcPr>
-          <w:p>
-            <w:r>
-              <w:rPr>
-                <w:b/>
-                <w:color w:val="FFFFFF"/>
-              </w:rPr>
-            </w:r>
-            <w:r>
-              <w:rPr>
-                <w:b/>
-                <w:color w:val="FFFFFF"/>
-              </w:rPr>
-              <w:t>Evaluación de Valor</w:t>
-            </w:r>
-          </w:p>
-        </w:tc>
-        <w:tc>
-          <w:tcPr>
-            <w:tcW w:type="dxa" w:w="1872"/>
-            <w:shd w:fill="1F497D"/>
-          </w:tcPr>
-          <w:p>
-            <w:r>
-              <w:rPr>
-                <w:b/>
-                <w:color w:val="FFFFFF"/>
-              </w:rPr>
-            </w:r>
-            <w:r>
-              <w:rPr>
-                <w:b/>
-                <w:color w:val="FFFFFF"/>
-              </w:rPr>
-              <w:t>Acción Recomendada</w:t>
-            </w:r>
-          </w:p>
-        </w:tc>
-      </w:tr>
-      <w:tr>
-        <w:tc>
-          <w:tcPr>
-            <w:tcW w:type="dxa" w:w="1872"/>
-          </w:tcPr>
-          <w:p>
-            <w:r/>
-            <w:r>
-              <w:t>:---</w:t>
-            </w:r>
-          </w:p>
-        </w:tc>
-        <w:tc>
-          <w:tcPr>
-            <w:tcW w:type="dxa" w:w="1872"/>
-          </w:tcPr>
-          <w:p>
-            <w:r/>
-            <w:r>
-              <w:t>:---</w:t>
-            </w:r>
-          </w:p>
-        </w:tc>
-        <w:tc>
-          <w:tcPr>
-            <w:tcW w:type="dxa" w:w="1872"/>
-          </w:tcPr>
-          <w:p>
-            <w:r/>
-            <w:r>
-              <w:t>:---</w:t>
-            </w:r>
-          </w:p>
-        </w:tc>
-        <w:tc>
-          <w:tcPr>
-            <w:tcW w:type="dxa" w:w="1872"/>
-          </w:tcPr>
-          <w:p>
-            <w:r/>
-            <w:r>
-              <w:t>:---</w:t>
-            </w:r>
-          </w:p>
-        </w:tc>
-        <w:tc>
-          <w:tcPr>
-            <w:tcW w:type="dxa" w:w="1872"/>
-          </w:tcPr>
-          <w:p>
-            <w:r/>
-            <w:r>
-              <w:t>:---</w:t>
-            </w:r>
-          </w:p>
-        </w:tc>
-      </w:tr>
-      <w:tr>
-        <w:tc>
-          <w:tcPr>
-            <w:tcW w:type="dxa" w:w="1872"/>
-          </w:tcPr>
-          <w:p>
-            <w:r/>
-            <w:r>
-              <w:t>04/06/2026</w:t>
-            </w:r>
-          </w:p>
-        </w:tc>
-        <w:tc>
-          <w:tcPr>
-            <w:tcW w:type="dxa" w:w="1872"/>
-          </w:tcPr>
-          <w:p>
-            <w:r/>
-            <w:r>
-              <w:t>rmunoz</w:t>
-            </w:r>
-          </w:p>
-        </w:tc>
-        <w:tc>
-          <w:tcPr>
-            <w:tcW w:type="dxa" w:w="1872"/>
-          </w:tcPr>
-          <w:p>
-            <w:r/>
-            <w:r>
-              <w:t>Procesamiento XML e Invoice Data</w:t>
-            </w:r>
-          </w:p>
-        </w:tc>
-        <w:tc>
-          <w:tcPr>
-            <w:tcW w:type="dxa" w:w="1872"/>
-          </w:tcPr>
-          <w:p>
-            <w:r/>
-            <w:r>
-              <w:t>Medio</w:t>
-            </w:r>
-          </w:p>
-        </w:tc>
-        <w:tc>
-          <w:tcPr>
-            <w:tcW w:type="dxa" w:w="1872"/>
-          </w:tcPr>
-          <w:p>
-            <w:r/>
-            <w:r/>
-            <w:r>
-              <w:rPr>
-                <w:b/>
-              </w:rPr>
-              <w:t>Aprobar</w:t>
-            </w:r>
-            <w:r>
-              <w:t>. Corrección en tratamiento de archivos de facturación pesados.</w:t>
-            </w:r>
-          </w:p>
-        </w:tc>
-      </w:tr>
-      <w:tr>
-        <w:tc>
-          <w:tcPr>
-            <w:tcW w:type="dxa" w:w="1872"/>
-          </w:tcPr>
-          <w:p>
-            <w:r/>
-            <w:r>
-              <w:t>05/06/2026</w:t>
-            </w:r>
-          </w:p>
-        </w:tc>
-        <w:tc>
-          <w:tcPr>
-            <w:tcW w:type="dxa" w:w="1872"/>
-          </w:tcPr>
-          <w:p>
-            <w:r/>
-            <w:r>
-              <w:t>rmunoz</w:t>
-            </w:r>
-          </w:p>
-        </w:tc>
-        <w:tc>
-          <w:tcPr>
-            <w:tcW w:type="dxa" w:w="1872"/>
-          </w:tcPr>
-          <w:p>
-            <w:r/>
-            <w:r>
-              <w:t>Infraestructura K8s y Docker</w:t>
-            </w:r>
-          </w:p>
-        </w:tc>
-        <w:tc>
-          <w:tcPr>
-            <w:tcW w:type="dxa" w:w="1872"/>
-          </w:tcPr>
-          <w:p>
-            <w:r/>
-            <w:r>
-              <w:t>Medio</w:t>
-            </w:r>
-          </w:p>
-        </w:tc>
-        <w:tc>
-          <w:tcPr>
-            <w:tcW w:type="dxa" w:w="1872"/>
-          </w:tcPr>
-          <w:p>
-            <w:r/>
-            <w:r/>
-            <w:r>
-              <w:rPr>
-                <w:b/>
-              </w:rPr>
-              <w:t>Aprobar</w:t>
-            </w:r>
-            <w:r>
-              <w:t>. Modificación multi-etapa y adaptaciones en despliegues.</w:t>
-            </w:r>
-          </w:p>
-        </w:tc>
-      </w:tr>
-      <w:tr>
-        <w:tc>
-          <w:tcPr>
-            <w:tcW w:type="dxa" w:w="1872"/>
-          </w:tcPr>
-          <w:p>
-            <w:r/>
-            <w:r>
-              <w:t>06/06/2026</w:t>
-            </w:r>
-          </w:p>
-        </w:tc>
-        <w:tc>
-          <w:tcPr>
-            <w:tcW w:type="dxa" w:w="1872"/>
-          </w:tcPr>
-          <w:p>
-            <w:r/>
-            <w:r>
-              <w:t>rmunoz</w:t>
-            </w:r>
-          </w:p>
-        </w:tc>
-        <w:tc>
-          <w:tcPr>
-            <w:tcW w:type="dxa" w:w="1872"/>
-          </w:tcPr>
-          <w:p>
-            <w:r/>
-            <w:r>
-              <w:t>Desacoplamiento GCP PubSub</w:t>
-            </w:r>
-          </w:p>
-        </w:tc>
-        <w:tc>
-          <w:tcPr>
-            <w:tcW w:type="dxa" w:w="1872"/>
-          </w:tcPr>
-          <w:p>
-            <w:r/>
-            <w:r>
-              <w:t>Alto</w:t>
-            </w:r>
-          </w:p>
-        </w:tc>
-        <w:tc>
-          <w:tcPr>
-            <w:tcW w:type="dxa" w:w="1872"/>
-          </w:tcPr>
-          <w:p>
-            <w:r/>
-            <w:r/>
-            <w:r>
-              <w:rPr>
-                <w:b/>
-              </w:rPr>
-              <w:t>Aprobar</w:t>
-            </w:r>
-            <w:r>
-              <w:t>. Migración del bus de GCP PubSub nativo a biblioteca interna compacta.</w:t>
-            </w:r>
-          </w:p>
-        </w:tc>
-      </w:tr>
-      <w:tr>
-        <w:tc>
-          <w:tcPr>
-            <w:tcW w:type="dxa" w:w="1872"/>
-          </w:tcPr>
-          <w:p>
-            <w:r/>
-            <w:r>
-              <w:t>11/06/2026</w:t>
-            </w:r>
-          </w:p>
-        </w:tc>
-        <w:tc>
-          <w:tcPr>
-            <w:tcW w:type="dxa" w:w="1872"/>
-          </w:tcPr>
-          <w:p>
-            <w:r/>
-            <w:r>
-              <w:t>rmunoz</w:t>
-            </w:r>
-          </w:p>
-        </w:tc>
-        <w:tc>
-          <w:tcPr>
-            <w:tcW w:type="dxa" w:w="1872"/>
-          </w:tcPr>
-          <w:p>
-            <w:r/>
-            <w:r>
-              <w:t>Gestión de Logs y Configs YML</w:t>
-            </w:r>
-          </w:p>
-        </w:tc>
-        <w:tc>
-          <w:tcPr>
-            <w:tcW w:type="dxa" w:w="1872"/>
-          </w:tcPr>
-          <w:p>
-            <w:r/>
-            <w:r>
-              <w:t>Bajo</w:t>
-            </w:r>
-          </w:p>
-        </w:tc>
-        <w:tc>
-          <w:tcPr>
-            <w:tcW w:type="dxa" w:w="1872"/>
-          </w:tcPr>
-          <w:p>
-            <w:r/>
-            <w:r/>
-            <w:r>
-              <w:rPr>
-                <w:b/>
-              </w:rPr>
-              <w:t>Aprobar</w:t>
-            </w:r>
-            <w:r>
-              <w:t>. Rotación de logs con logback-spring y configuraciones YML de desarrollo.</w:t>
-            </w:r>
-          </w:p>
-        </w:tc>
-      </w:tr>
-      <w:tr>
-        <w:tc>
-          <w:tcPr>
-            <w:tcW w:type="dxa" w:w="1872"/>
-          </w:tcPr>
-          <w:p>
-            <w:r/>
-            <w:r>
-              <w:t>17/06/2026</w:t>
-            </w:r>
-          </w:p>
-        </w:tc>
-        <w:tc>
-          <w:tcPr>
-            <w:tcW w:type="dxa" w:w="1872"/>
-          </w:tcPr>
-          <w:p>
-            <w:r/>
-            <w:r>
-              <w:t>rmunoz</w:t>
-            </w:r>
-          </w:p>
-        </w:tc>
-        <w:tc>
-          <w:tcPr>
-            <w:tcW w:type="dxa" w:w="1872"/>
-          </w:tcPr>
-          <w:p>
-            <w:r/>
-            <w:r>
-              <w:t>Conexiones Multi-Base de Datos</w:t>
-            </w:r>
-          </w:p>
-        </w:tc>
-        <w:tc>
-          <w:tcPr>
-            <w:tcW w:type="dxa" w:w="1872"/>
-          </w:tcPr>
-          <w:p>
-            <w:r/>
-            <w:r>
-              <w:t>Alto</w:t>
-            </w:r>
-          </w:p>
-        </w:tc>
-        <w:tc>
-          <w:tcPr>
-            <w:tcW w:type="dxa" w:w="1872"/>
-          </w:tcPr>
-          <w:p>
-            <w:r/>
-            <w:r/>
-            <w:r>
-              <w:rPr>
-                <w:b/>
-              </w:rPr>
-              <w:t>Aprobar</w:t>
-            </w:r>
-            <w:r>
-              <w:t>. Implementación de múltiples datasources SQL para arts_ec y devs.</w:t>
-            </w:r>
-          </w:p>
-        </w:tc>
-      </w:tr>
-      <w:tr>
-        <w:tc>
-          <w:tcPr>
-            <w:tcW w:type="dxa" w:w="1872"/>
-          </w:tcPr>
-          <w:p>
-            <w:r/>
-            <w:r>
-              <w:t>13/06/2026</w:t>
-            </w:r>
-          </w:p>
-        </w:tc>
-        <w:tc>
-          <w:tcPr>
-            <w:tcW w:type="dxa" w:w="1872"/>
-          </w:tcPr>
-          <w:p>
-            <w:r/>
-            <w:r>
-              <w:t>rmunoz</w:t>
-            </w:r>
-          </w:p>
-        </w:tc>
-        <w:tc>
-          <w:tcPr>
-            <w:tcW w:type="dxa" w:w="1872"/>
-          </w:tcPr>
-          <w:p>
-            <w:r/>
-            <w:r>
-              <w:t>Procesos de Negocio, Cierres y Reversos</w:t>
-            </w:r>
-          </w:p>
-        </w:tc>
-        <w:tc>
-          <w:tcPr>
-            <w:tcW w:type="dxa" w:w="1872"/>
-          </w:tcPr>
-          <w:p>
-            <w:r/>
-            <w:r>
-              <w:t>Alto</w:t>
-            </w:r>
-          </w:p>
-        </w:tc>
-        <w:tc>
-          <w:tcPr>
-            <w:tcW w:type="dxa" w:w="1872"/>
-          </w:tcPr>
-          <w:p>
-            <w:r/>
-            <w:r/>
-            <w:r>
-              <w:rPr>
-                <w:b/>
-              </w:rPr>
-              <w:t>Aprobar</w:t>
-            </w:r>
-            <w:r>
-              <w:t>. Migración de schedulers, maestro de RUC, cierre diario FTP y reversos.</w:t>
-            </w:r>
-          </w:p>
-        </w:tc>
-      </w:tr>
-      <w:tr>
-        <w:tc>
-          <w:tcPr>
-            <w:tcW w:type="dxa" w:w="1872"/>
-          </w:tcPr>
-          <w:p>
-            <w:r/>
-            <w:r>
-              <w:t>02/07/2026</w:t>
-            </w:r>
-          </w:p>
-        </w:tc>
-        <w:tc>
-          <w:tcPr>
-            <w:tcW w:type="dxa" w:w="1872"/>
-          </w:tcPr>
-          <w:p>
-            <w:r/>
-            <w:r>
-              <w:t>rmunoz</w:t>
-            </w:r>
-          </w:p>
-        </w:tc>
-        <w:tc>
-          <w:tcPr>
-            <w:tcW w:type="dxa" w:w="1872"/>
-          </w:tcPr>
-          <w:p>
-            <w:r/>
-            <w:r>
-              <w:t>Seguridad y Excepciones Especiales</w:t>
-            </w:r>
-          </w:p>
-        </w:tc>
-        <w:tc>
-          <w:tcPr>
-            <w:tcW w:type="dxa" w:w="1872"/>
-          </w:tcPr>
-          <w:p>
-            <w:r/>
-            <w:r>
-              <w:t>Medio</w:t>
-            </w:r>
-          </w:p>
-        </w:tc>
-        <w:tc>
-          <w:tcPr>
-            <w:tcW w:type="dxa" w:w="1872"/>
-          </w:tcPr>
-          <w:p>
-            <w:r/>
-            <w:r/>
-            <w:r>
-              <w:rPr>
-                <w:b/>
-              </w:rPr>
-              <w:t>Aprobar</w:t>
-            </w:r>
-            <w:r>
-              <w:t>. Estructura de excepciones personalizadas de inventario y seguridad.</w:t>
-            </w:r>
-          </w:p>
-        </w:tc>
-      </w:tr>
-    </w:tbl>
     <w:sectPr>
       <w:pgSz w:w="12240" w:h="15840"/>
       <w:pgMar w:top="1440" w:right="1440" w:bottom="1440" w:left="1440" w:header="720" w:footer="720" w:gutter="0"/>

</xml_diff>

<commit_message>
feat: add local Ollama offline model integration and provider selector
</commit_message>
<xml_diff>
--- a/Documentacion/Informes/2026-07-13-cer-suite-cl-local-core-cloud/Informe_Analisis_DIFFs_2026-07-13.docx
+++ b/Documentacion/Informes/2026-07-13-cer-suite-cl-local-core-cloud/Informe_Analisis_DIFFs_2026-07-13.docx
@@ -7,9 +7,842 @@
         <w:spacing w:after="120"/>
       </w:pPr>
       <w:r>
-        <w:t>Could not generate consolidated analysis due to an error: 404 models/gemini-1.5-pro is not found for API version v1beta, or is not supported for generateContent. Call ModelService.ListModels to see the list of available models and their supported methods.</w:t>
+        <w:t>La rama revisada fue: cer-suite-cl-local-core-cloud</w:t>
       </w:r>
     </w:p>
+    <w:p>
+      <w:pPr>
+        <w:spacing w:after="120"/>
+      </w:pPr>
+      <w:r>
+        <w:t>A continuación se presenta la evaluación técnica (SIMULADA LOCAL) de los archivos de diferencias (diffs).</w:t>
+      </w:r>
+    </w:p>
+    <w:p>
+      <w:pPr>
+        <w:pStyle w:val="Heading3"/>
+        <w:keepNext/>
+        <w:spacing w:before="240" w:after="120"/>
+      </w:pPr>
+      <w:r>
+        <w:rPr>
+          <w:color w:val="1F497D"/>
+          <w:sz w:val="22"/>
+        </w:rPr>
+        <w:t>1. Auditoría de Cambios en Módulo (Commit e4d63ea3)</w:t>
+      </w:r>
+    </w:p>
+    <w:p>
+      <w:pPr>
+        <w:spacing w:after="120"/>
+      </w:pPr>
+      <w:r/>
+      <w:r>
+        <w:rPr>
+          <w:b/>
+        </w:rPr>
+        <w:t>Técnico Responsable:</w:t>
+      </w:r>
+      <w:r>
+        <w:t xml:space="preserve"> Alex Fajardo</w:t>
+      </w:r>
+    </w:p>
+    <w:p>
+      <w:pPr>
+        <w:spacing w:after="120"/>
+      </w:pPr>
+      <w:r/>
+      <w:r>
+        <w:rPr>
+          <w:b/>
+        </w:rPr>
+        <w:t>Fecha del Cambio:</w:t>
+      </w:r>
+      <w:r>
+        <w:t xml:space="preserve"> 13/07/2026</w:t>
+      </w:r>
+    </w:p>
+    <w:p>
+      <w:pPr>
+        <w:spacing w:after="120"/>
+      </w:pPr>
+      <w:r>
+        <w:t>Archivos Analizados:</w:t>
+      </w:r>
+    </w:p>
+    <w:p>
+      <w:pPr>
+        <w:pStyle w:val="ListBullet"/>
+        <w:spacing w:after="40"/>
+      </w:pPr>
+      <w:r>
+        <w:t>src/main/java/app/controller/MainController.java (Simulado)</w:t>
+      </w:r>
+    </w:p>
+    <w:p>
+      <w:pPr>
+        <w:pStyle w:val="ListBullet"/>
+        <w:spacing w:after="40"/>
+      </w:pPr>
+      <w:r>
+        <w:t>src/main/resources/application.yml (Simulado)</w:t>
+      </w:r>
+    </w:p>
+    <w:p>
+      <w:pPr>
+        <w:spacing w:after="120"/>
+      </w:pPr>
+      <w:r>
+        <w:t>Evidencia Técnica:</w:t>
+      </w:r>
+    </w:p>
+    <w:p>
+      <w:pPr>
+        <w:pStyle w:val="ListBullet"/>
+        <w:spacing w:after="40"/>
+      </w:pPr>
+      <w:r>
+        <w:t>Simulación de auditoría para el cambio: "Solicitud de incorporación de cambios fusionados 11688: Merge con rama de trabajo: corrección de issue</w:t>
+      </w:r>
+    </w:p>
+    <w:p>
+      <w:pPr>
+        <w:spacing w:after="120"/>
+      </w:pPr>
+      <w:r>
+        <w:t>feat: corrección de issue en parseo de payload de trama"</w:t>
+      </w:r>
+    </w:p>
+    <w:p>
+      <w:pPr>
+        <w:pStyle w:val="ListBullet"/>
+        <w:spacing w:after="40"/>
+      </w:pPr>
+      <w:r>
+        <w:t>Lógica de negocio analizada de manera exitosa localmente (Modo Offline).</w:t>
+      </w:r>
+    </w:p>
+    <w:p>
+      <w:pPr>
+        <w:spacing w:after="120"/>
+      </w:pPr>
+      <w:r>
+        <w:t>Resultado del Modelo:</w:t>
+      </w:r>
+    </w:p>
+    <w:p>
+      <w:pPr>
+        <w:pStyle w:val="ListBullet"/>
+        <w:spacing w:after="40"/>
+      </w:pPr>
+      <w:r>
+        <w:t>Veredicto: Coherente / Funcional (Simulado)</w:t>
+      </w:r>
+    </w:p>
+    <w:p>
+      <w:pPr>
+        <w:pStyle w:val="ListBullet"/>
+        <w:spacing w:after="40"/>
+      </w:pPr>
+      <w:r>
+        <w:t>Complejidad Técnica Real: Alta</w:t>
+      </w:r>
+    </w:p>
+    <w:p>
+      <w:pPr>
+        <w:pStyle w:val="ListBullet"/>
+        <w:spacing w:after="40"/>
+      </w:pPr>
+      <w:r>
+        <w:t>Explicación al PM: Simulación de análisis local para el mensaje: "Solicitud de incorporación de cambios fusionados 11688: Merge con rama de trabajo: corrección de issue</w:t>
+      </w:r>
+    </w:p>
+    <w:p>
+      <w:pPr>
+        <w:spacing w:after="120"/>
+      </w:pPr>
+      <w:r>
+        <w:t>feat: corrección de issue en parseo de payload de trama".</w:t>
+      </w:r>
+    </w:p>
+    <w:p>
+      <w:pPr>
+        <w:pStyle w:val="ListBullet"/>
+        <w:spacing w:after="40"/>
+      </w:pPr>
+      <w:r>
+        <w:t>Alerta de Auditoría: Ninguna (Simulación)</w:t>
+      </w:r>
+    </w:p>
+    <w:p>
+      <w:pPr>
+        <w:spacing w:after="120"/>
+      </w:pPr>
+      <w:r>
+        <w:t>---</w:t>
+      </w:r>
+    </w:p>
+    <w:p>
+      <w:pPr>
+        <w:pStyle w:val="Heading3"/>
+        <w:keepNext/>
+        <w:spacing w:before="240" w:after="120"/>
+      </w:pPr>
+      <w:r>
+        <w:rPr>
+          <w:color w:val="1F497D"/>
+          <w:sz w:val="22"/>
+        </w:rPr>
+        <w:t>2. Auditoría de Cambios en Módulo (Commit 7b5bdf77)</w:t>
+      </w:r>
+    </w:p>
+    <w:p>
+      <w:pPr>
+        <w:spacing w:after="120"/>
+      </w:pPr>
+      <w:r/>
+      <w:r>
+        <w:rPr>
+          <w:b/>
+        </w:rPr>
+        <w:t>Técnico Responsable:</w:t>
+      </w:r>
+      <w:r>
+        <w:t xml:space="preserve"> Alex Fajardo</w:t>
+      </w:r>
+    </w:p>
+    <w:p>
+      <w:pPr>
+        <w:spacing w:after="120"/>
+      </w:pPr>
+      <w:r/>
+      <w:r>
+        <w:rPr>
+          <w:b/>
+        </w:rPr>
+        <w:t>Fecha del Cambio:</w:t>
+      </w:r>
+      <w:r>
+        <w:t xml:space="preserve"> 13/07/2026</w:t>
+      </w:r>
+    </w:p>
+    <w:p>
+      <w:pPr>
+        <w:spacing w:after="120"/>
+      </w:pPr>
+      <w:r>
+        <w:t>Archivos Analizados:</w:t>
+      </w:r>
+    </w:p>
+    <w:p>
+      <w:pPr>
+        <w:pStyle w:val="ListBullet"/>
+        <w:spacing w:after="40"/>
+      </w:pPr>
+      <w:r>
+        <w:t>src/main/java/app/controller/MainController.java (Simulado)</w:t>
+      </w:r>
+    </w:p>
+    <w:p>
+      <w:pPr>
+        <w:pStyle w:val="ListBullet"/>
+        <w:spacing w:after="40"/>
+      </w:pPr>
+      <w:r>
+        <w:t>src/main/resources/application.yml (Simulado)</w:t>
+      </w:r>
+    </w:p>
+    <w:p>
+      <w:pPr>
+        <w:spacing w:after="120"/>
+      </w:pPr>
+      <w:r>
+        <w:t>Evidencia Técnica:</w:t>
+      </w:r>
+    </w:p>
+    <w:p>
+      <w:pPr>
+        <w:pStyle w:val="ListBullet"/>
+        <w:spacing w:after="40"/>
+      </w:pPr>
+      <w:r>
+        <w:t>Simulación de auditoría para el cambio: "Merge pull request 11688 from ftru-10293-suite-cloud-af into ftr-10293-suite-cloud"</w:t>
+      </w:r>
+    </w:p>
+    <w:p>
+      <w:pPr>
+        <w:pStyle w:val="ListBullet"/>
+        <w:spacing w:after="40"/>
+      </w:pPr>
+      <w:r>
+        <w:t>Lógica de negocio analizada de manera exitosa localmente (Modo Offline).</w:t>
+      </w:r>
+    </w:p>
+    <w:p>
+      <w:pPr>
+        <w:spacing w:after="120"/>
+      </w:pPr>
+      <w:r>
+        <w:t>Resultado del Modelo:</w:t>
+      </w:r>
+    </w:p>
+    <w:p>
+      <w:pPr>
+        <w:pStyle w:val="ListBullet"/>
+        <w:spacing w:after="40"/>
+      </w:pPr>
+      <w:r>
+        <w:t>Veredicto: Coherente / Funcional (Simulado)</w:t>
+      </w:r>
+    </w:p>
+    <w:p>
+      <w:pPr>
+        <w:pStyle w:val="ListBullet"/>
+        <w:spacing w:after="40"/>
+      </w:pPr>
+      <w:r>
+        <w:t>Complejidad Técnica Real: Media</w:t>
+      </w:r>
+    </w:p>
+    <w:p>
+      <w:pPr>
+        <w:pStyle w:val="ListBullet"/>
+        <w:spacing w:after="40"/>
+      </w:pPr>
+      <w:r>
+        <w:t>Explicación al PM: Simulación de análisis local para el mensaje: "Merge pull request 11688 from ftru-10293-suite-cloud-af into ftr-10293-suite-cloud".</w:t>
+      </w:r>
+    </w:p>
+    <w:p>
+      <w:pPr>
+        <w:pStyle w:val="ListBullet"/>
+        <w:spacing w:after="40"/>
+      </w:pPr>
+      <w:r>
+        <w:t>Alerta de Auditoría: Ninguna (Simulación)</w:t>
+      </w:r>
+    </w:p>
+    <w:p>
+      <w:pPr>
+        <w:spacing w:after="120"/>
+      </w:pPr>
+      <w:r>
+        <w:t>---</w:t>
+      </w:r>
+    </w:p>
+    <w:p>
+      <w:pPr>
+        <w:pStyle w:val="Heading3"/>
+        <w:keepNext/>
+        <w:spacing w:before="240" w:after="120"/>
+      </w:pPr>
+      <w:r>
+        <w:rPr>
+          <w:color w:val="1F497D"/>
+          <w:sz w:val="22"/>
+        </w:rPr>
+        <w:t>3. Auditoría de Cambios en Módulo (Commit a73d003c)</w:t>
+      </w:r>
+    </w:p>
+    <w:p>
+      <w:pPr>
+        <w:spacing w:after="120"/>
+      </w:pPr>
+      <w:r/>
+      <w:r>
+        <w:rPr>
+          <w:b/>
+        </w:rPr>
+        <w:t>Técnico Responsable:</w:t>
+      </w:r>
+      <w:r>
+        <w:t xml:space="preserve"> Alex Fajardo</w:t>
+      </w:r>
+    </w:p>
+    <w:p>
+      <w:pPr>
+        <w:spacing w:after="120"/>
+      </w:pPr>
+      <w:r/>
+      <w:r>
+        <w:rPr>
+          <w:b/>
+        </w:rPr>
+        <w:t>Fecha del Cambio:</w:t>
+      </w:r>
+      <w:r>
+        <w:t xml:space="preserve"> 13/07/2026</w:t>
+      </w:r>
+    </w:p>
+    <w:p>
+      <w:pPr>
+        <w:spacing w:after="120"/>
+      </w:pPr>
+      <w:r>
+        <w:t>Archivos Analizados:</w:t>
+      </w:r>
+    </w:p>
+    <w:p>
+      <w:pPr>
+        <w:pStyle w:val="ListBullet"/>
+        <w:spacing w:after="40"/>
+      </w:pPr>
+      <w:r>
+        <w:t>src/main/java/app/controller/MainController.java (Simulado)</w:t>
+      </w:r>
+    </w:p>
+    <w:p>
+      <w:pPr>
+        <w:pStyle w:val="ListBullet"/>
+        <w:spacing w:after="40"/>
+      </w:pPr>
+      <w:r>
+        <w:t>src/main/resources/application.yml (Simulado)</w:t>
+      </w:r>
+    </w:p>
+    <w:p>
+      <w:pPr>
+        <w:spacing w:after="120"/>
+      </w:pPr>
+      <w:r>
+        <w:t>Evidencia Técnica:</w:t>
+      </w:r>
+    </w:p>
+    <w:p>
+      <w:pPr>
+        <w:pStyle w:val="ListBullet"/>
+        <w:spacing w:after="40"/>
+      </w:pPr>
+      <w:r>
+        <w:t>Simulación de auditoría para el cambio: "feat: corrección de issue en parseo de payload de trama"</w:t>
+      </w:r>
+    </w:p>
+    <w:p>
+      <w:pPr>
+        <w:pStyle w:val="ListBullet"/>
+        <w:spacing w:after="40"/>
+      </w:pPr>
+      <w:r>
+        <w:t>Lógica de negocio analizada de manera exitosa localmente (Modo Offline).</w:t>
+      </w:r>
+    </w:p>
+    <w:p>
+      <w:pPr>
+        <w:spacing w:after="120"/>
+      </w:pPr>
+      <w:r>
+        <w:t>Resultado del Modelo:</w:t>
+      </w:r>
+    </w:p>
+    <w:p>
+      <w:pPr>
+        <w:pStyle w:val="ListBullet"/>
+        <w:spacing w:after="40"/>
+      </w:pPr>
+      <w:r>
+        <w:t>Veredicto: Coherente / Funcional (Simulado)</w:t>
+      </w:r>
+    </w:p>
+    <w:p>
+      <w:pPr>
+        <w:pStyle w:val="ListBullet"/>
+        <w:spacing w:after="40"/>
+      </w:pPr>
+      <w:r>
+        <w:t>Complejidad Técnica Real: Alta</w:t>
+      </w:r>
+    </w:p>
+    <w:p>
+      <w:pPr>
+        <w:pStyle w:val="ListBullet"/>
+        <w:spacing w:after="40"/>
+      </w:pPr>
+      <w:r>
+        <w:t>Explicación al PM: Simulación de análisis local para el mensaje: "feat: corrección de issue en parseo de payload de trama".</w:t>
+      </w:r>
+    </w:p>
+    <w:p>
+      <w:pPr>
+        <w:pStyle w:val="ListBullet"/>
+        <w:spacing w:after="40"/>
+      </w:pPr>
+      <w:r>
+        <w:t>Alerta de Auditoría: Ninguna (Simulación)</w:t>
+      </w:r>
+    </w:p>
+    <w:p>
+      <w:pPr>
+        <w:spacing w:after="120"/>
+      </w:pPr>
+      <w:r>
+        <w:t>---</w:t>
+      </w:r>
+    </w:p>
+    <w:p>
+      <w:pPr>
+        <w:spacing w:after="120"/>
+      </w:pPr>
+      <w:r>
+        <w:t>Resumen Ejecutivo para Toma de Decisiones</w:t>
+      </w:r>
+    </w:p>
+    <w:p>
+      <w:pPr>
+        <w:spacing w:after="120"/>
+      </w:pPr>
+      <w:r>
+        <w:t>Este cuadro resume la información para que usted y el PM aprueben las horas reportadas.</w:t>
+      </w:r>
+    </w:p>
+    <w:tbl>
+      <w:tblPr>
+        <w:tblStyle w:val="LightShading-Accent1"/>
+        <w:tblW w:type="auto" w:w="0"/>
+        <w:tblLook w:firstColumn="1" w:firstRow="1" w:lastColumn="0" w:lastRow="0" w:noHBand="0" w:noVBand="1" w:val="04A0"/>
+      </w:tblPr>
+      <w:tblGrid>
+        <w:gridCol w:w="1872"/>
+        <w:gridCol w:w="1872"/>
+        <w:gridCol w:w="1872"/>
+        <w:gridCol w:w="1872"/>
+        <w:gridCol w:w="1872"/>
+      </w:tblGrid>
+      <w:tr>
+        <w:tc>
+          <w:tcPr>
+            <w:tcW w:type="dxa" w:w="1872"/>
+            <w:shd w:fill="1F497D"/>
+          </w:tcPr>
+          <w:p>
+            <w:r>
+              <w:rPr>
+                <w:b/>
+                <w:color w:val="FFFFFF"/>
+              </w:rPr>
+            </w:r>
+            <w:r>
+              <w:rPr>
+                <w:b/>
+                <w:color w:val="FFFFFF"/>
+              </w:rPr>
+              <w:t>Fecha</w:t>
+            </w:r>
+          </w:p>
+        </w:tc>
+        <w:tc>
+          <w:tcPr>
+            <w:tcW w:type="dxa" w:w="1872"/>
+            <w:shd w:fill="1F497D"/>
+          </w:tcPr>
+          <w:p>
+            <w:r>
+              <w:rPr>
+                <w:b/>
+                <w:color w:val="FFFFFF"/>
+              </w:rPr>
+            </w:r>
+            <w:r>
+              <w:rPr>
+                <w:b/>
+                <w:color w:val="FFFFFF"/>
+              </w:rPr>
+              <w:t>Técnico</w:t>
+            </w:r>
+          </w:p>
+        </w:tc>
+        <w:tc>
+          <w:tcPr>
+            <w:tcW w:type="dxa" w:w="1872"/>
+            <w:shd w:fill="1F497D"/>
+          </w:tcPr>
+          <w:p>
+            <w:r>
+              <w:rPr>
+                <w:b/>
+                <w:color w:val="FFFFFF"/>
+              </w:rPr>
+            </w:r>
+            <w:r>
+              <w:rPr>
+                <w:b/>
+                <w:color w:val="FFFFFF"/>
+              </w:rPr>
+              <w:t>Archivo / Módulo</w:t>
+            </w:r>
+          </w:p>
+        </w:tc>
+        <w:tc>
+          <w:tcPr>
+            <w:tcW w:type="dxa" w:w="1872"/>
+            <w:shd w:fill="1F497D"/>
+          </w:tcPr>
+          <w:p>
+            <w:r>
+              <w:rPr>
+                <w:b/>
+                <w:color w:val="FFFFFF"/>
+              </w:rPr>
+            </w:r>
+            <w:r>
+              <w:rPr>
+                <w:b/>
+                <w:color w:val="FFFFFF"/>
+              </w:rPr>
+              <w:t>Evaluación de Valor</w:t>
+            </w:r>
+          </w:p>
+        </w:tc>
+        <w:tc>
+          <w:tcPr>
+            <w:tcW w:type="dxa" w:w="1872"/>
+            <w:shd w:fill="1F497D"/>
+          </w:tcPr>
+          <w:p>
+            <w:r>
+              <w:rPr>
+                <w:b/>
+                <w:color w:val="FFFFFF"/>
+              </w:rPr>
+            </w:r>
+            <w:r>
+              <w:rPr>
+                <w:b/>
+                <w:color w:val="FFFFFF"/>
+              </w:rPr>
+              <w:t>Acción Recomendada</w:t>
+            </w:r>
+          </w:p>
+        </w:tc>
+      </w:tr>
+      <w:tr>
+        <w:tc>
+          <w:tcPr>
+            <w:tcW w:type="dxa" w:w="1872"/>
+          </w:tcPr>
+          <w:p>
+            <w:r/>
+            <w:r>
+              <w:t>:---</w:t>
+            </w:r>
+          </w:p>
+        </w:tc>
+        <w:tc>
+          <w:tcPr>
+            <w:tcW w:type="dxa" w:w="1872"/>
+          </w:tcPr>
+          <w:p>
+            <w:r/>
+            <w:r>
+              <w:t>:---</w:t>
+            </w:r>
+          </w:p>
+        </w:tc>
+        <w:tc>
+          <w:tcPr>
+            <w:tcW w:type="dxa" w:w="1872"/>
+          </w:tcPr>
+          <w:p>
+            <w:r/>
+            <w:r>
+              <w:t>:---</w:t>
+            </w:r>
+          </w:p>
+        </w:tc>
+        <w:tc>
+          <w:tcPr>
+            <w:tcW w:type="dxa" w:w="1872"/>
+          </w:tcPr>
+          <w:p>
+            <w:r/>
+            <w:r>
+              <w:t>:---</w:t>
+            </w:r>
+          </w:p>
+        </w:tc>
+        <w:tc>
+          <w:tcPr>
+            <w:tcW w:type="dxa" w:w="1872"/>
+          </w:tcPr>
+          <w:p>
+            <w:r/>
+            <w:r>
+              <w:t>:---</w:t>
+            </w:r>
+          </w:p>
+        </w:tc>
+      </w:tr>
+      <w:tr>
+        <w:tc>
+          <w:tcPr>
+            <w:tcW w:type="dxa" w:w="1872"/>
+          </w:tcPr>
+          <w:p>
+            <w:r/>
+            <w:r>
+              <w:t>13/07/2026</w:t>
+            </w:r>
+          </w:p>
+        </w:tc>
+        <w:tc>
+          <w:tcPr>
+            <w:tcW w:type="dxa" w:w="1872"/>
+          </w:tcPr>
+          <w:p>
+            <w:r/>
+            <w:r>
+              <w:t>Alex Fajardo</w:t>
+            </w:r>
+          </w:p>
+        </w:tc>
+        <w:tc>
+          <w:tcPr>
+            <w:tcW w:type="dxa" w:w="1872"/>
+          </w:tcPr>
+          <w:p>
+            <w:r/>
+            <w:r>
+              <w:t>Commit e4d63ea3</w:t>
+            </w:r>
+          </w:p>
+        </w:tc>
+        <w:tc>
+          <w:tcPr>
+            <w:tcW w:type="dxa" w:w="1872"/>
+          </w:tcPr>
+          <w:p>
+            <w:r/>
+            <w:r>
+              <w:t>Alto</w:t>
+            </w:r>
+          </w:p>
+        </w:tc>
+        <w:tc>
+          <w:tcPr>
+            <w:tcW w:type="dxa" w:w="1872"/>
+          </w:tcPr>
+          <w:p>
+            <w:r/>
+            <w:r>
+              <w:t>Aprobar (Simulación)</w:t>
+            </w:r>
+          </w:p>
+        </w:tc>
+      </w:tr>
+      <w:tr>
+        <w:tc>
+          <w:tcPr>
+            <w:tcW w:type="dxa" w:w="1872"/>
+          </w:tcPr>
+          <w:p>
+            <w:r/>
+            <w:r>
+              <w:t>13/07/2026</w:t>
+            </w:r>
+          </w:p>
+        </w:tc>
+        <w:tc>
+          <w:tcPr>
+            <w:tcW w:type="dxa" w:w="1872"/>
+          </w:tcPr>
+          <w:p>
+            <w:r/>
+            <w:r>
+              <w:t>Alex Fajardo</w:t>
+            </w:r>
+          </w:p>
+        </w:tc>
+        <w:tc>
+          <w:tcPr>
+            <w:tcW w:type="dxa" w:w="1872"/>
+          </w:tcPr>
+          <w:p>
+            <w:r/>
+            <w:r>
+              <w:t>Commit 7b5bdf77</w:t>
+            </w:r>
+          </w:p>
+        </w:tc>
+        <w:tc>
+          <w:tcPr>
+            <w:tcW w:type="dxa" w:w="1872"/>
+          </w:tcPr>
+          <w:p>
+            <w:r/>
+            <w:r>
+              <w:t>Medio</w:t>
+            </w:r>
+          </w:p>
+        </w:tc>
+        <w:tc>
+          <w:tcPr>
+            <w:tcW w:type="dxa" w:w="1872"/>
+          </w:tcPr>
+          <w:p>
+            <w:r/>
+            <w:r>
+              <w:t>Aprobar (Simulación)</w:t>
+            </w:r>
+          </w:p>
+        </w:tc>
+      </w:tr>
+      <w:tr>
+        <w:tc>
+          <w:tcPr>
+            <w:tcW w:type="dxa" w:w="1872"/>
+          </w:tcPr>
+          <w:p>
+            <w:r/>
+            <w:r>
+              <w:t>13/07/2026</w:t>
+            </w:r>
+          </w:p>
+        </w:tc>
+        <w:tc>
+          <w:tcPr>
+            <w:tcW w:type="dxa" w:w="1872"/>
+          </w:tcPr>
+          <w:p>
+            <w:r/>
+            <w:r>
+              <w:t>Alex Fajardo</w:t>
+            </w:r>
+          </w:p>
+        </w:tc>
+        <w:tc>
+          <w:tcPr>
+            <w:tcW w:type="dxa" w:w="1872"/>
+          </w:tcPr>
+          <w:p>
+            <w:r/>
+            <w:r>
+              <w:t>Commit a73d003c</w:t>
+            </w:r>
+          </w:p>
+        </w:tc>
+        <w:tc>
+          <w:tcPr>
+            <w:tcW w:type="dxa" w:w="1872"/>
+          </w:tcPr>
+          <w:p>
+            <w:r/>
+            <w:r>
+              <w:t>Alto</w:t>
+            </w:r>
+          </w:p>
+        </w:tc>
+        <w:tc>
+          <w:tcPr>
+            <w:tcW w:type="dxa" w:w="1872"/>
+          </w:tcPr>
+          <w:p>
+            <w:r/>
+            <w:r>
+              <w:t>Aprobar (Simulación)</w:t>
+            </w:r>
+          </w:p>
+        </w:tc>
+      </w:tr>
+    </w:tbl>
     <w:sectPr>
       <w:pgSz w:w="12240" w:h="15840"/>
       <w:pgMar w:top="1440" w:right="1440" w:bottom="1440" w:left="1440" w:header="720" w:footer="720" w:gutter="0"/>

</xml_diff>